<commit_message>
Alterações na documentação, correção do .env e a adição dos documentos 'finais'
</commit_message>
<xml_diff>
--- a/src/main/resources/templates/grade-modelo.docx
+++ b/src/main/resources/templates/grade-modelo.docx
@@ -1092,90 +1092,56 @@
               <w:rPr>
                 <w:sz w:val="18"/>
               </w:rPr>
-              <w:t>ESPANHOL</w:t>
+              <w:t>E</w:t>
             </w:r>
+          </w:p>
+        </w:tc>
+        <w:tc>
+          <w:tcPr>
+            <w:tcW w:w="3795" w:type="dxa"/>
+            <w:tcBorders>
+              <w:top w:val="single" w:sz="12" w:space="0" w:color="DDDDDD"/>
+            </w:tcBorders>
+          </w:tcPr>
+          <w:p>
+            <w:pPr>
+              <w:pStyle w:val="TableParagraph"/>
+              <w:spacing w:before="41"/>
+              <w:ind w:left="41"/>
+              <w:rPr>
+                <w:sz w:val="18"/>
+              </w:rPr>
+            </w:pPr>
             <w:r>
               <w:rPr>
-                <w:spacing w:val="-15"/>
                 <w:sz w:val="18"/>
               </w:rPr>
-              <w:t xml:space="preserve"> </w:t>
+              <w:t>C</w:t>
             </w:r>
-            <w:r>
+          </w:p>
+        </w:tc>
+        <w:tc>
+          <w:tcPr>
+            <w:tcW w:w="1110" w:type="dxa"/>
+            <w:tcBorders>
+              <w:top w:val="single" w:sz="12" w:space="0" w:color="DDDDDD"/>
+            </w:tcBorders>
+          </w:tcPr>
+          <w:p>
+            <w:pPr>
+              <w:pStyle w:val="TableParagraph"/>
+              <w:spacing w:before="41"/>
+              <w:ind w:left="31"/>
               <w:rPr>
                 <w:sz w:val="18"/>
               </w:rPr>
-              <w:t>I</w:t>
-            </w:r>
-            <w:r>
-              <w:rPr>
-                <w:spacing w:val="-8"/>
-                <w:sz w:val="18"/>
-              </w:rPr>
-              <w:t xml:space="preserve"> </w:t>
-            </w:r>
+            </w:pPr>
             <w:r>
               <w:rPr>
                 <w:spacing w:val="-2"/>
                 <w:sz w:val="18"/>
               </w:rPr>
-              <w:t>(Determinada)</w:t>
-            </w:r>
-          </w:p>
-        </w:tc>
-        <w:tc>
-          <w:tcPr>
-            <w:tcW w:w="3795" w:type="dxa"/>
-            <w:tcBorders>
-              <w:top w:val="single" w:sz="12" w:space="0" w:color="DDDDDD"/>
-            </w:tcBorders>
-          </w:tcPr>
-          <w:p>
-            <w:pPr>
-              <w:pStyle w:val="TableParagraph"/>
-              <w:spacing w:before="41"/>
-              <w:ind w:left="41"/>
-              <w:rPr>
-                <w:sz w:val="18"/>
-              </w:rPr>
-            </w:pPr>
-            <w:r>
-              <w:rPr>
-                <w:sz w:val="18"/>
-              </w:rPr>
-              <w:t xml:space="preserve">Comércio </w:t>
-            </w:r>
-            <w:r>
-              <w:rPr>
-                <w:spacing w:val="-2"/>
-                <w:sz w:val="18"/>
-              </w:rPr>
-              <w:t>Exterior</w:t>
-            </w:r>
-          </w:p>
-        </w:tc>
-        <w:tc>
-          <w:tcPr>
-            <w:tcW w:w="1110" w:type="dxa"/>
-            <w:tcBorders>
-              <w:top w:val="single" w:sz="12" w:space="0" w:color="DDDDDD"/>
-            </w:tcBorders>
-          </w:tcPr>
-          <w:p>
-            <w:pPr>
-              <w:pStyle w:val="TableParagraph"/>
-              <w:spacing w:before="41"/>
-              <w:ind w:left="31"/>
-              <w:rPr>
-                <w:sz w:val="18"/>
-              </w:rPr>
-            </w:pPr>
-            <w:r>
-              <w:rPr>
-                <w:spacing w:val="-2"/>
-                <w:sz w:val="18"/>
-              </w:rPr>
-              <w:t>Tarde</w:t>
+              <w:t>T</w:t>
             </w:r>
           </w:p>
         </w:tc>
@@ -1201,7 +1167,7 @@
                 <w:spacing w:val="-2"/>
                 <w:sz w:val="18"/>
               </w:rPr>
-              <w:t>Ministrando</w:t>
+              <w:t>M</w:t>
             </w:r>
           </w:p>
         </w:tc>
@@ -1224,10 +1190,9 @@
             </w:pPr>
             <w:r>
               <w:rPr>
-                <w:spacing w:val="-10"/>
                 <w:sz w:val="18"/>
               </w:rPr>
-              <w:t>2</w:t>
+              <w:t>0</w:t>
             </w:r>
           </w:p>
         </w:tc>
@@ -1253,84 +1218,50 @@
               <w:rPr>
                 <w:sz w:val="18"/>
               </w:rPr>
-              <w:t>ESPANHOL</w:t>
+              <w:t>E</w:t>
             </w:r>
+          </w:p>
+        </w:tc>
+        <w:tc>
+          <w:tcPr>
+            <w:tcW w:w="3795" w:type="dxa"/>
+          </w:tcPr>
+          <w:p>
+            <w:pPr>
+              <w:pStyle w:val="TableParagraph"/>
+              <w:spacing w:before="41"/>
+              <w:ind w:left="41"/>
+              <w:rPr>
+                <w:sz w:val="18"/>
+              </w:rPr>
+            </w:pPr>
             <w:r>
               <w:rPr>
-                <w:spacing w:val="-15"/>
                 <w:sz w:val="18"/>
               </w:rPr>
-              <w:t xml:space="preserve"> </w:t>
+              <w:t>G</w:t>
             </w:r>
-            <w:r>
+          </w:p>
+        </w:tc>
+        <w:tc>
+          <w:tcPr>
+            <w:tcW w:w="1110" w:type="dxa"/>
+          </w:tcPr>
+          <w:p>
+            <w:pPr>
+              <w:pStyle w:val="TableParagraph"/>
+              <w:spacing w:before="41"/>
+              <w:ind w:left="31"/>
               <w:rPr>
                 <w:sz w:val="18"/>
               </w:rPr>
-              <w:t>II</w:t>
-            </w:r>
-            <w:r>
-              <w:rPr>
-                <w:spacing w:val="-8"/>
-                <w:sz w:val="18"/>
-              </w:rPr>
-              <w:t xml:space="preserve"> </w:t>
-            </w:r>
+            </w:pPr>
             <w:r>
               <w:rPr>
                 <w:spacing w:val="-2"/>
                 <w:sz w:val="18"/>
               </w:rPr>
-              <w:t>(Determinada)</w:t>
-            </w:r>
-          </w:p>
-        </w:tc>
-        <w:tc>
-          <w:tcPr>
-            <w:tcW w:w="3795" w:type="dxa"/>
-          </w:tcPr>
-          <w:p>
-            <w:pPr>
-              <w:pStyle w:val="TableParagraph"/>
-              <w:spacing w:before="41"/>
-              <w:ind w:left="41"/>
-              <w:rPr>
-                <w:sz w:val="18"/>
-              </w:rPr>
-            </w:pPr>
-            <w:r>
-              <w:rPr>
-                <w:sz w:val="18"/>
-              </w:rPr>
-              <w:t xml:space="preserve">Gestão de Recursos </w:t>
-            </w:r>
-            <w:r>
-              <w:rPr>
-                <w:spacing w:val="-2"/>
-                <w:sz w:val="18"/>
-              </w:rPr>
-              <w:t>Humanos</w:t>
-            </w:r>
-          </w:p>
-        </w:tc>
-        <w:tc>
-          <w:tcPr>
-            <w:tcW w:w="1110" w:type="dxa"/>
-          </w:tcPr>
-          <w:p>
-            <w:pPr>
-              <w:pStyle w:val="TableParagraph"/>
-              <w:spacing w:before="41"/>
-              <w:ind w:left="31"/>
-              <w:rPr>
-                <w:sz w:val="18"/>
-              </w:rPr>
-            </w:pPr>
-            <w:r>
-              <w:rPr>
-                <w:spacing w:val="-2"/>
-                <w:sz w:val="18"/>
-              </w:rPr>
-              <w:t>Manhã</w:t>
+              <w:t>M</w:t>
             </w:r>
           </w:p>
         </w:tc>
@@ -1353,7 +1284,7 @@
                 <w:spacing w:val="-2"/>
                 <w:sz w:val="18"/>
               </w:rPr>
-              <w:t>Ministrando</w:t>
+              <w:t>M</w:t>
             </w:r>
           </w:p>
         </w:tc>
@@ -1373,10 +1304,9 @@
             </w:pPr>
             <w:r>
               <w:rPr>
-                <w:spacing w:val="-10"/>
                 <w:sz w:val="18"/>
               </w:rPr>
-              <w:t>2</w:t>
+              <w:t>0</w:t>
             </w:r>
           </w:p>
         </w:tc>
@@ -1402,84 +1332,50 @@
               <w:rPr>
                 <w:sz w:val="18"/>
               </w:rPr>
-              <w:t>ESPANHOL</w:t>
+              <w:t>E</w:t>
             </w:r>
+          </w:p>
+        </w:tc>
+        <w:tc>
+          <w:tcPr>
+            <w:tcW w:w="3795" w:type="dxa"/>
+          </w:tcPr>
+          <w:p>
+            <w:pPr>
+              <w:pStyle w:val="TableParagraph"/>
+              <w:spacing w:before="41"/>
+              <w:ind w:left="41"/>
+              <w:rPr>
+                <w:sz w:val="18"/>
+              </w:rPr>
+            </w:pPr>
             <w:r>
               <w:rPr>
-                <w:spacing w:val="-15"/>
                 <w:sz w:val="18"/>
               </w:rPr>
-              <w:t xml:space="preserve"> </w:t>
+              <w:t>C</w:t>
             </w:r>
-            <w:r>
+          </w:p>
+        </w:tc>
+        <w:tc>
+          <w:tcPr>
+            <w:tcW w:w="1110" w:type="dxa"/>
+          </w:tcPr>
+          <w:p>
+            <w:pPr>
+              <w:pStyle w:val="TableParagraph"/>
+              <w:spacing w:before="41"/>
+              <w:ind w:left="31"/>
               <w:rPr>
                 <w:sz w:val="18"/>
               </w:rPr>
-              <w:t>IV</w:t>
-            </w:r>
-            <w:r>
-              <w:rPr>
-                <w:spacing w:val="-8"/>
-                <w:sz w:val="18"/>
-              </w:rPr>
-              <w:t xml:space="preserve"> </w:t>
-            </w:r>
+            </w:pPr>
             <w:r>
               <w:rPr>
                 <w:spacing w:val="-2"/>
                 <w:sz w:val="18"/>
               </w:rPr>
-              <w:t>(Determinada)</w:t>
-            </w:r>
-          </w:p>
-        </w:tc>
-        <w:tc>
-          <w:tcPr>
-            <w:tcW w:w="3795" w:type="dxa"/>
-          </w:tcPr>
-          <w:p>
-            <w:pPr>
-              <w:pStyle w:val="TableParagraph"/>
-              <w:spacing w:before="41"/>
-              <w:ind w:left="41"/>
-              <w:rPr>
-                <w:sz w:val="18"/>
-              </w:rPr>
-            </w:pPr>
-            <w:r>
-              <w:rPr>
-                <w:sz w:val="18"/>
-              </w:rPr>
-              <w:t xml:space="preserve">Comércio </w:t>
-            </w:r>
-            <w:r>
-              <w:rPr>
-                <w:spacing w:val="-2"/>
-                <w:sz w:val="18"/>
-              </w:rPr>
-              <w:t>Exterior</w:t>
-            </w:r>
-          </w:p>
-        </w:tc>
-        <w:tc>
-          <w:tcPr>
-            <w:tcW w:w="1110" w:type="dxa"/>
-          </w:tcPr>
-          <w:p>
-            <w:pPr>
-              <w:pStyle w:val="TableParagraph"/>
-              <w:spacing w:before="41"/>
-              <w:ind w:left="31"/>
-              <w:rPr>
-                <w:sz w:val="18"/>
-              </w:rPr>
-            </w:pPr>
-            <w:r>
-              <w:rPr>
-                <w:spacing w:val="-2"/>
-                <w:sz w:val="18"/>
-              </w:rPr>
-              <w:t>Noite</w:t>
+              <w:t>N</w:t>
             </w:r>
           </w:p>
         </w:tc>
@@ -1502,7 +1398,7 @@
                 <w:spacing w:val="-2"/>
                 <w:sz w:val="18"/>
               </w:rPr>
-              <w:t>Ministrando</w:t>
+              <w:t>M</w:t>
             </w:r>
           </w:p>
         </w:tc>
@@ -1525,7 +1421,7 @@
                 <w:spacing w:val="-10"/>
                 <w:sz w:val="18"/>
               </w:rPr>
-              <w:t>2</w:t>
+              <w:t>0</w:t>
             </w:r>
           </w:p>
         </w:tc>

</xml_diff>